<commit_message>
Verify all 181 references; formal decomposition of evaluation error; PDF via MathML
- references.py rebuilt from arXiv API (full author lists), OpenReview venues, Crossref DOIs and conference pages;
  title-only keys replaced by author-year keys; workshop papers labelled as such; published versions cited
- New formal statement in Section 4.2 (error decomposition, four propositions) and estimand table (Table 4); tables renumbered
- Abstract and contributions updated; Fig. 4 annotated with formal quantities
- Fix: corresponding-author email lost its @ in the PDF (pandoc citation parsing); restored
- PDF now built through pandoc HTML + MathML + headless Chromium so equations render

Co-Authored-By: Claude Opus 5.5 <noreply@anthropic.com>
Claude-Session: https://claude.ai/code/session_01Mo5faDW38HYd76T4YfMx6p
</commit_message>
<xml_diff>
--- a/manuscript/cover_letter.docx
+++ b/manuscript/cover_letter.docx
@@ -76,7 +76,7 @@
           <w:bCs/>
           <w:b/>
         </w:rPr>
-        <w:t xml:space="preserve">When Models Know They Are Being Tested: A Structured Review of Evaluation Awareness, Sandbagging and Related Model-Originated Threats to the Validity of Large Language Model Evaluation</w:t>
+        <w:t xml:space="preserve">When Models Know They Are Being Tested: A Scoping Review of Evaluation Awareness, Sandbagging and Related Model-Originated Threats to the Validity of Large Language Model Evaluation</w:t>
       </w:r>
       <w:r>
         <w:rPr>
@@ -120,7 +120,25 @@
         <w:pStyle w:val="BodyText"/>
       </w:pPr>
       <w:r>
-        <w:t xml:space="preserve">Decisions about deploying and governing large language models increasingly rest on evaluation results. A rapidly growing literature, most of it from 2025–2026, reports that models can recognise when they are being evaluated and may behave differently as a result. They may underperform on capability tests, appear safer on alignment tests, or mislead automated graders. These are threats that originate in the evaluated model itself rather than in benchmark design. To our knowledge they have not been synthesised as a single validity problem: existing reviews address AI deception broadly, benchmark construct validity, or evaluation–safety failures in general.</w:t>
+        <w:t xml:space="preserve">Decisions about deploying and governing large language models increasingly rest on evaluation results. A rapidly growing literature, most of it from 2025–2026, reports that models can recognise when they are being evaluated and may behave differently as a result. They may underperform on capability tests, appear safer on alignment tests, or mislead automated graders. These are threats that originate in the evaluated model itself rather than in benchmark design. To our knowledge they have not been synthesised as a single validity problem: existing reviews address AI deception broadly, benchmark construct validity, reward hacking, or evaluation–safety failures in general, and the one review of the AI</w:t>
+      </w:r>
+      <w:r>
+        <w:t xml:space="preserve"> </w:t>
+      </w:r>
+      <w:r>
+        <w:t xml:space="preserve">“</w:t>
+      </w:r>
+      <w:r>
+        <w:t xml:space="preserve">observer effect</w:t>
+      </w:r>
+      <w:r>
+        <w:t xml:space="preserve">”</w:t>
+      </w:r>
+      <w:r>
+        <w:t xml:space="preserve"> </w:t>
+      </w:r>
+      <w:r>
+        <w:t xml:space="preserve">predates the 2025–2026 measurement literature.</w:t>
       </w:r>
     </w:p>
     <w:p>
@@ -140,7 +158,7 @@
         <w:pStyle w:val="Compact"/>
       </w:pPr>
       <w:r>
-        <w:t xml:space="preserve">A documented evidence map of 225 sources, selected from 418 screened records, with all queries, screening decisions and counts released as reproducible scripts and data.</w:t>
+        <w:t xml:space="preserve">An evidence map of 315 studies, identified through Scopus, arXiv, Semantic Scholar and logged web searches (5649 database and 418 web records), with all queries, raw API responses, screening decisions and counts released as reproducible scripts and data. The full texts of 37 anchor studies were read and every quantitative claim about them checked.</w:t>
       </w:r>
     </w:p>
     <w:p>
@@ -164,7 +182,7 @@
         <w:pStyle w:val="Compact"/>
       </w:pPr>
       <w:r>
-        <w:t xml:space="preserve">A comparison of measurement methods with their validity evidence and documented failure modes, and a typed analysis of five apparent contradictions.</w:t>
+        <w:t xml:space="preserve">A comparison of measurement methods with their validity evidence and documented failure modes, and a typed analysis of seven apparent contradictions.</w:t>
       </w:r>
     </w:p>
     <w:p>
@@ -192,7 +210,7 @@
         <w:pStyle w:val="BodyText"/>
       </w:pPr>
       <w:r>
-        <w:t xml:space="preserve">The manuscript is transparent about its limitations. Because licensed bibliographic databases and full texts were not accessible in the environment used, records were identified through logged web searches and charted at abstract level. We therefore describe the work as a structured critical review with a scoping-style evidence map, not as a PRISMA-ScR-compliant scoping review. As set out in the AI-use statement, an AI system was used extensively to run and log searches, apply scripted screening and charting rules, generate figures, and draft text. The authors directed the work and take full responsibility for it.</w:t>
+        <w:t xml:space="preserve">The manuscript is transparent about its limitations. Screening was performed by one reviewer assisted by an AI system; we report an audited rule-assisted pre-screen, inter-pass agreement (Cohen’s κ = 0.747) and layer-assignment agreement (κ = 0.881), and we read full texts only for the anchor set. As set out in the AI-use statement, an AI system was used extensively to run and log searches, apply scripted screening and charting rules, generate figures, and draft text. The authors directed the work and take full responsibility for it.</w:t>
       </w:r>
     </w:p>
     <w:p>

</xml_diff>

<commit_message>
Revise after internal referee review: tiered evidence map, honest provenance, corrected formalism
- One written tier rule applied to all 315 charted studies (167 core, 148 adjacent); evidence map reported for core tier
- Source types re-coded (archival / workshop / preprint / grey) against verified venues; anchor read levels and arXiv versions recorded
- PRISMA flow redrawn with automation-tool exclusions; arithmetic reconciled; search recall reported
- Protocol amendments v0.2/v0.3 and all deviations reported; AI role in screening stated; kappas relabelled as consistency
- Formal section corrected (assumptions A1-A2, awareness in the policy, support condition, elicitation term, remarks)
- Overclaims hedged; non-anchor numbers marked with daggers; citation keys fixed; PRISMA-ScR checklist (S6) and protocol (S0) added

Co-Authored-By: Claude Opus 5.5 <noreply@anthropic.com>
Claude-Session: https://claude.ai/code/session_01Mo5faDW38HYd76T4YfMx6p
</commit_message>
<xml_diff>
--- a/manuscript/cover_letter.docx
+++ b/manuscript/cover_letter.docx
@@ -158,7 +158,7 @@
         <w:pStyle w:val="Compact"/>
       </w:pPr>
       <w:r>
-        <w:t xml:space="preserve">An evidence map of 315 studies, identified through Scopus, arXiv, Semantic Scholar and logged web searches (5649 database and 418 web records), with all queries, raw API responses, screening decisions and counts released as reproducible scripts and data. The full texts of 37 anchor studies were read and every quantitative claim about them checked.</w:t>
+        <w:t xml:space="preserve">A tiered evidence map of 167 core and 148 adjacent studies, identified through Scopus, arXiv, Semantic Scholar and logged web searches (5649 database and 418 web records), with the protocol and amendments, all queries, raw API responses, screening decisions and counts released as reproducible scripts and data. The full texts of 37 anchor studies were read, every quantitative claim about them was checked, and their reporting was audited against a twelve-item checklist with independent double coding.</w:t>
       </w:r>
     </w:p>
     <w:p>
@@ -170,7 +170,7 @@
         <w:pStyle w:val="Compact"/>
       </w:pPr>
       <w:r>
-        <w:t xml:space="preserve">A four-layer framework (context signal, awareness, behavioural divergence, validity consequence) that separates constructs the literature frequently conflates.</w:t>
+        <w:t xml:space="preserve">A four-layer framework (context signal, awareness, behavioural divergence, validity consequence), formalised as a decomposition of evaluation error that states what each study design can and cannot identify.</w:t>
       </w:r>
     </w:p>
     <w:p>
@@ -210,7 +210,7 @@
         <w:pStyle w:val="BodyText"/>
       </w:pPr>
       <w:r>
-        <w:t xml:space="preserve">The manuscript is transparent about its limitations. Screening was performed by one reviewer assisted by an AI system; we report an audited rule-assisted pre-screen, inter-pass agreement (Cohen’s κ = 0.747) and layer-assignment agreement (κ = 0.881), and we read full texts only for the anchor set. As set out in the AI-use statement, an AI system was used extensively to run and log searches, apply scripted screening and charting rules, generate figures, and draft text. The authors directed the work and take full responsibility for it.</w:t>
+        <w:t xml:space="preserve">The manuscript is transparent about its limitations. Screening and charting were performed by an AI system against written criteria under the authors’ direction, without a second human reviewer; we report consistency statistics for these AI-assisted processes (not human inter-rater reliability) and list a human audit as the main outstanding check. Full texts were read for the anchor set only. As set out in the AI-use statement, an AI system was used extensively to run and log searches, apply scripted screening and charting rules, generate figures, and draft text. The authors directed the work and take full responsibility for it.</w:t>
       </w:r>
     </w:p>
     <w:p>

</xml_diff>

<commit_message>
Align methods, limitations, abstract and cover letter with the authors' AI-use statement and verification; new repository link
Co-Authored-By: Claude Opus 5.5 <noreply@anthropic.com>
Claude-Session: https://claude.ai/code/session_01Mo5faDW38HYd76T4YfMx6p
</commit_message>
<xml_diff>
--- a/manuscript/cover_letter.docx
+++ b/manuscript/cover_letter.docx
@@ -10,19 +10,19 @@
         <w:t xml:space="preserve">Dr Divya Meena S</w:t>
       </w:r>
       <w:r>
-        <w:t xml:space="preserve"> </w:t>
+        <w:br/>
       </w:r>
       <w:r>
         <w:t xml:space="preserve">School of Computer Science and Engineering</w:t>
       </w:r>
       <w:r>
-        <w:t xml:space="preserve"> </w:t>
+        <w:br/>
       </w:r>
       <w:r>
         <w:t xml:space="preserve">Vellore Institute of Technology, Vellore, Tamil Nadu, India</w:t>
       </w:r>
       <w:r>
-        <w:t xml:space="preserve"> </w:t>
+        <w:br/>
       </w:r>
       <w:r>
         <w:t xml:space="preserve">divyameena.s@vit.ac.in</w:t>
@@ -210,7 +210,7 @@
         <w:pStyle w:val="BodyText"/>
       </w:pPr>
       <w:r>
-        <w:t xml:space="preserve">The manuscript is transparent about its limitations. Screening and charting were performed by an AI system against written criteria under the authors’ direction, without a second human reviewer; we report consistency statistics for these AI-assisted processes (not human inter-rater reliability) and list a human audit as the main outstanding check. Full texts were read for the anchor set only. As set out in the AI-use statement, an AI system was used extensively to run and log searches, apply scripted screening and charting rules, generate figures, and draft text. The authors directed the work and take full responsibility for it.</w:t>
+        <w:t xml:space="preserve">The manuscript is transparent about its limitations. Screening and charting were AI-assisted and verified by the authors, without independent dual screening; we report consistency statistics for these processes. Full texts were read for the anchor set only. Generative AI use is disclosed in the declarations in line with Springer Nature policy, and the authors take full responsibility for the content.</w:t>
       </w:r>
     </w:p>
     <w:p>
@@ -245,13 +245,13 @@
         <w:t xml:space="preserve">Divya Meena S (corresponding author), on behalf of both authors</w:t>
       </w:r>
       <w:r>
-        <w:t xml:space="preserve"> </w:t>
+        <w:br/>
       </w:r>
       <w:r>
         <w:t xml:space="preserve">P N Bhargav Teja</w:t>
       </w:r>
       <w:r>
-        <w:t xml:space="preserve"> </w:t>
+        <w:br/>
       </w:r>
       <w:r>
         <w:t xml:space="preserve">School of Computer Science and Engineering, Vellore Institute of Technology, Vellore</w:t>

</xml_diff>